<commit_message>
Update SAiGE Word document
Co-Authored-By: Claude Sonnet 5.5 <noreply@anthropic.com>
</commit_message>
<xml_diff>
--- a/SPIG_GMAB_SAiGE_EN.docx
+++ b/SPIG_GMAB_SAiGE_EN.docx
@@ -59,10 +59,7 @@
       </w:r>
       <w:proofErr w:type="spellEnd"/>
       <w:r>
-        <w:t xml:space="preserve"> is the shared system for all SPIG-GMAB companies worldwide. It combines Artificial Intelligence with the Group’s technical know-how to manage every customer request through to order, using three agents and a human review after each stage. Every project is a GATE, connecting information, calculations, quotations, revisions</w:t>
-      </w:r>
-      <w:r>
-        <w:t xml:space="preserve"> and approvals.</w:t>
+        <w:t xml:space="preserve"> is the shared system for all SPIG-GMAB companies worldwide. It combines Artificial Intelligence with the Group’s technical know-how to manage every customer request through to order, using three agents and a human review after each stage. Every project is a GATE, connecting information, calculations, quotations, revisions and approvals.</w:t>
       </w:r>
     </w:p>
     <w:p>
@@ -328,10 +325,7 @@
       </w:r>
       <w:proofErr w:type="spellEnd"/>
       <w:r>
-        <w:t>, collects the available documentation</w:t>
-      </w:r>
-      <w:r>
-        <w:t xml:space="preserve"> and proposes the operating path: what the customer is requesting and which activities SPIG-GMAB must perform. It highlights missing or ambiguous information without replacing it with assumptions. This stage prepares the next steps but does not start calculations or design before the required review.</w:t>
+        <w:t>, collects the available documentation and proposes the operating path: what the customer is requesting and which activities SPIG-GMAB must perform. It highlights missing or ambiguous information without replacing it with assumptions. This stage prepares the next steps but does not start calculations or design before the required review.</w:t>
       </w:r>
     </w:p>
     <w:p>
@@ -580,10 +574,7 @@
         <w:jc w:val="both"/>
       </w:pPr>
       <w:r>
-        <w:t>Only after human approval of the solution does the agent collect the technical bill of materials, calculations, drawings</w:t>
-      </w:r>
-      <w:r>
-        <w:t xml:space="preserve"> and financial assessments from the GATE and turn them into a complete draft quotation. It uses the validated results to describe the solution, scope of supply and performance, linking them to the proposed price, options, commercial terms and attachments.</w:t>
+        <w:t>Only after human approval of the solution does the agent collect the technical bill of materials, calculations, drawings and financial assessments from the GATE and turn them into a complete draft quotation. It uses the validated results to describe the solution, scope of supply and performance, linking them to the proposed price, options, commercial terms and attachments.</w:t>
       </w:r>
     </w:p>
     <w:p>
@@ -597,10 +588,7 @@
         <w:t>organizes</w:t>
       </w:r>
       <w:r>
-        <w:t xml:space="preserve"> assumptions and exclusions and checks that the document is consistent with the approved configuration. It highlights open points, missing content</w:t>
-      </w:r>
-      <w:r>
-        <w:t xml:space="preserve"> or inconsistencies for Sales Engineering review. It does not independently modify the technical solution or introduce new calculations; it makes the work completed in previous stages clear and usable for the customer.</w:t>
+        <w:t xml:space="preserve"> assumptions and exclusions and checks that the document is consistent with the approved configuration. It highlights open points, missing content or inconsistencies for Sales Engineering review. It does not independently modify the technical solution or introduce new calculations; it makes the work completed in previous stages clear and usable for the customer.</w:t>
       </w:r>
     </w:p>
     <w:p>
@@ -625,10 +613,7 @@
       </w:r>
       <w:proofErr w:type="gramEnd"/>
       <w:r>
-        <w:t xml:space="preserve"> completeness and alignment between what the customer requested, what was approved</w:t>
-      </w:r>
-      <w:r>
-        <w:t xml:space="preserve"> and what is </w:t>
+        <w:t xml:space="preserve"> completeness and alignment between what the customer requested, what was approved and what is </w:t>
       </w:r>
       <w:proofErr w:type="gramStart"/>
       <w:r>
@@ -695,10 +680,7 @@
         <w:jc w:val="both"/>
       </w:pPr>
       <w:r>
-        <w:t>The process does not end with the first quotation. Customer dialogue may introduce clarifications, new requests, alternatives, additional checks</w:t>
-      </w:r>
-      <w:r>
-        <w:t xml:space="preserve"> or changes to the proposed terms. Every communication updates the existing GATE and is linked to the relevant solution and quotation. Stage 1 is not repeated for every revision; work continues in the same GATE.</w:t>
+        <w:t>The process does not end with the first quotation. Customer dialogue may introduce clarifications, new requests, alternatives, additional checks or changes to the proposed terms. Every communication updates the existing GATE and is linked to the relevant solution and quotation. Stage 1 is not repeated for every revision; work continues in the same GATE.</w:t>
       </w:r>
     </w:p>
     <w:p>
@@ -706,10 +688,7 @@
         <w:jc w:val="both"/>
       </w:pPr>
       <w:r>
-        <w:t>The process returns to the stage affected by the change. If requirements, configuration or technical checks change, it returns to Stage 2; if the change concerns only commercial or document content, it returns</w:t>
-      </w:r>
-      <w:r>
-        <w:t xml:space="preserve"> to Stage 3. This distinction avoids repeating unaffected activities while preventing reuse of results that are no longer valid.</w:t>
+        <w:t>The process returns to the stage affected by the change. If requirements, configuration or technical checks change, it returns to Stage 2; if the change concerns only commercial or document content, it returns to Stage 3. This distinction avoids repeating unaffected activities while preventing reuse of results that are no longer valid.</w:t>
       </w:r>
     </w:p>
     <w:p>
@@ -794,10 +773,7 @@
         <w:jc w:val="both"/>
       </w:pPr>
       <w:r>
-        <w:t>When the order is received</w:t>
-      </w:r>
-      <w:r>
-        <w:t>, the GATE makes it possible to verify that the customer’s confirmation matches the approved quotation and configuration. The result is a continuous path from the initial request to the final order, with automation, expertise and accountability clearly connected.</w:t>
+        <w:t>When the order is received, the GATE makes it possible to verify that the customer’s confirmation matches the approved quotation and configuration. The result is a continuous path from the initial request to the final order, with automation, expertise and accountability clearly connected.</w:t>
       </w:r>
     </w:p>
     <w:p>

</xml_diff>